<commit_message>
Preserve all lines in Request 4
</commit_message>
<xml_diff>
--- a/reflective_report.docx
+++ b/reflective_report.docx
@@ -1226,7 +1226,7 @@
           </w:tcPr>
           <w:p>
             <w:r>
-              <w:t>$46,090.42</w:t>
+              <w:t>$46,093.24</w:t>
             </w:r>
           </w:p>
         </w:tc>
@@ -1252,7 +1252,7 @@
           </w:tcPr>
           <w:p>
             <w:r>
-              <w:t>Net increase of $1,030.72</w:t>
+              <w:t>Net increase of $1,033.54</w:t>
             </w:r>
           </w:p>
         </w:tc>

</xml_diff>